<commit_message>
Rebuild phase 2 complete
</commit_message>
<xml_diff>
--- a/docassemble/privacydocgenerator/data/templates/gap_analysis_memo.docx
+++ b/docassemble/privacydocgenerator/data/templates/gap_analysis_memo.docx
@@ -157,6 +157,8 @@
         <w:gridCol w:w="1800"/>
         <w:gridCol w:w="1800"/>
         <w:gridCol w:w="1360"/>
+        <w:gridCol w:w="2160"/>
+        <w:gridCol w:w="2160"/>
       </w:tblGrid>
       <w:tr>
         <w:trPr>
@@ -324,6 +326,26 @@
             </w:r>
           </w:p>
         </w:tc>
+        <w:tc>
+          <w:tcPr>
+            <w:tcW w:type="dxa" w:w="2160"/>
+          </w:tcPr>
+          <w:p>
+            <w:r>
+              <w:t>Policy Section</w:t>
+            </w:r>
+          </w:p>
+        </w:tc>
+        <w:tc>
+          <w:tcPr>
+            <w:tcW w:type="dxa" w:w="2160"/>
+          </w:tcPr>
+          <w:p>
+            <w:r>
+              <w:t>Why It Matters</w:t>
+            </w:r>
+          </w:p>
+        </w:tc>
       </w:tr>
       <w:tr>
         <w:tc>
@@ -484,6 +506,26 @@
             </w:r>
           </w:p>
         </w:tc>
+        <w:tc>
+          <w:tcPr>
+            <w:tcW w:type="dxa" w:w="2160"/>
+          </w:tcPr>
+          <w:p>
+            <w:r>
+              <w:t>{{ f['policy_section'] }}</w:t>
+            </w:r>
+          </w:p>
+        </w:tc>
+        <w:tc>
+          <w:tcPr>
+            <w:tcW w:type="dxa" w:w="2160"/>
+          </w:tcPr>
+          <w:p>
+            <w:r>
+              <w:t>{{ f['why_it_matters'] }}</w:t>
+            </w:r>
+          </w:p>
+        </w:tc>
       </w:tr>
       <w:tr>
         <w:tc>
@@ -642,6 +684,22 @@
               </w:rPr>
               <w:t xml:space="preserve"/>
             </w:r>
+          </w:p>
+        </w:tc>
+        <w:tc>
+          <w:tcPr>
+            <w:tcW w:type="dxa" w:w="2160"/>
+          </w:tcPr>
+          <w:p>
+            <w:r/>
+          </w:p>
+        </w:tc>
+        <w:tc>
+          <w:tcPr>
+            <w:tcW w:type="dxa" w:w="2160"/>
+          </w:tcPr>
+          <w:p>
+            <w:r/>
           </w:p>
         </w:tc>
       </w:tr>

</xml_diff>